<commit_message>
Se agrego la carpeta Catedra a la estructura
</commit_message>
<xml_diff>
--- a/01_Gestion de configuracion/DOC_Reglas_SCM_v1.docx
+++ b/01_Gestion de configuracion/DOC_Reglas_SCM_v1.docx
@@ -1,6 +1,6 @@
 
 <file path=word/document.xml><?xml version="1.0" encoding="utf-8"?>
-<w:document xmlns:wpc="http://schemas.microsoft.com/office/word/2010/wordprocessingCanvas" xmlns:cx="http://schemas.microsoft.com/office/drawing/2014/chartex" xmlns:cx1="http://schemas.microsoft.com/office/drawing/2015/9/8/chartex" xmlns:cx2="http://schemas.microsoft.com/office/drawing/2015/10/21/chartex" xmlns:cx3="http://schemas.microsoft.com/office/drawing/2016/5/9/chartex" xmlns:cx4="http://schemas.microsoft.com/office/drawing/2016/5/10/chartex" xmlns:cx5="http://schemas.microsoft.com/office/drawing/2016/5/11/chartex" xmlns:cx6="http://schemas.microsoft.com/office/drawing/2016/5/12/chartex" xmlns:cx7="http://schemas.microsoft.com/office/drawing/2016/5/13/chartex" xmlns:cx8="http://schemas.microsoft.com/office/drawing/2016/5/14/chartex" xmlns:mc="http://schemas.openxmlformats.org/markup-compatibility/2006" xmlns:aink="http://schemas.microsoft.com/office/drawing/2016/ink" xmlns:am3d="http://schemas.microsoft.com/office/drawing/2017/model3d" xmlns:o="urn:schemas-microsoft-com:office:office" xmlns:oel="http://schemas.microsoft.com/office/2019/extlst" xmlns:r="http://schemas.openxmlformats.org/officeDocument/2006/relationships" xmlns:m="http://schemas.openxmlformats.org/officeDocument/2006/math" xmlns:v="urn:schemas-microsoft-com:vml" xmlns:wp14="http://schemas.microsoft.com/office/word/2010/wordprocessingDrawing" xmlns:wp="http://schemas.openxmlformats.org/drawingml/2006/wordprocessingDrawing" xmlns:w10="urn:schemas-microsoft-com:office:word" xmlns:w="http://schemas.openxmlformats.org/wordprocessingml/2006/main" xmlns:w14="http://schemas.microsoft.com/office/word/2010/wordml" xmlns:w15="http://schemas.microsoft.com/office/word/2012/wordml" xmlns:w16cex="http://schemas.microsoft.com/office/word/2018/wordml/cex" xmlns:w16cid="http://schemas.microsoft.com/office/word/2016/wordml/cid" xmlns:w16="http://schemas.microsoft.com/office/word/2018/wordml" xmlns:w16du="http://schemas.microsoft.com/office/word/2023/wordml/word16du" xmlns:w16sdtdh="http://schemas.microsoft.com/office/word/2020/wordml/sdtdatahash" xmlns:w16sdtfl="http://schemas.microsoft.com/office/word/2024/wordml/sdtformatlock" xmlns:w16se="http://schemas.microsoft.com/office/word/2015/wordml/symex" xmlns:wpg="http://schemas.microsoft.com/office/word/2010/wordprocessingGroup" xmlns:wpi="http://schemas.microsoft.com/office/word/2010/wordprocessingInk" xmlns:wne="http://schemas.microsoft.com/office/word/2006/wordml" xmlns:wps="http://schemas.microsoft.com/office/word/2010/wordprocessingShape" mc:Ignorable="w14 w15 w16se w16cid w16 w16cex w16sdtdh w16sdtfl w16du wp14">
+<w:document xmlns:wpc="http://schemas.microsoft.com/office/word/2010/wordprocessingCanvas" xmlns:cx="http://schemas.microsoft.com/office/drawing/2014/chartex" xmlns:cx1="http://schemas.microsoft.com/office/drawing/2015/9/8/chartex" xmlns:cx2="http://schemas.microsoft.com/office/drawing/2015/10/21/chartex" xmlns:cx3="http://schemas.microsoft.com/office/drawing/2016/5/9/chartex" xmlns:cx4="http://schemas.microsoft.com/office/drawing/2016/5/10/chartex" xmlns:cx5="http://schemas.microsoft.com/office/drawing/2016/5/11/chartex" xmlns:cx6="http://schemas.microsoft.com/office/drawing/2016/5/12/chartex" xmlns:cx7="http://schemas.microsoft.com/office/drawing/2016/5/13/chartex" xmlns:cx8="http://schemas.microsoft.com/office/drawing/2016/5/14/chartex" xmlns:mc="http://schemas.openxmlformats.org/markup-compatibility/2006" xmlns:aink="http://schemas.microsoft.com/office/drawing/2016/ink" xmlns:am3d="http://schemas.microsoft.com/office/drawing/2017/model3d" xmlns:o="urn:schemas-microsoft-com:office:office" xmlns:oel="http://schemas.microsoft.com/office/2019/extlst" xmlns:r="http://schemas.openxmlformats.org/officeDocument/2006/relationships" xmlns:m="http://schemas.openxmlformats.org/officeDocument/2006/math" xmlns:v="urn:schemas-microsoft-com:vml" xmlns:wp14="http://schemas.microsoft.com/office/word/2010/wordprocessingDrawing" xmlns:wp="http://schemas.openxmlformats.org/drawingml/2006/wordprocessingDrawing" xmlns:w10="urn:schemas-microsoft-com:office:word" xmlns:w="http://schemas.openxmlformats.org/wordprocessingml/2006/main" xmlns:w14="http://schemas.microsoft.com/office/word/2010/wordml" xmlns:w15="http://schemas.microsoft.com/office/word/2012/wordml" xmlns:w16cex="http://schemas.microsoft.com/office/word/2018/wordml/cex" xmlns:w16cid="http://schemas.microsoft.com/office/word/2016/wordml/cid" xmlns:w16="http://schemas.microsoft.com/office/word/2018/wordml" xmlns:w16sdtdh="http://schemas.microsoft.com/office/word/2020/wordml/sdtdatahash" xmlns:w16se="http://schemas.microsoft.com/office/word/2015/wordml/symex" xmlns:wpg="http://schemas.microsoft.com/office/word/2010/wordprocessingGroup" xmlns:wpi="http://schemas.microsoft.com/office/word/2010/wordprocessingInk" xmlns:wne="http://schemas.microsoft.com/office/word/2006/wordml" xmlns:wps="http://schemas.microsoft.com/office/word/2010/wordprocessingShape" mc:Ignorable="w14 w15 w16se w16cid w16 w16cex w16sdtdh wp14">
   <w:body>
     <w:p>
       <w:pPr>
@@ -281,15 +281,7 @@
         </w:numPr>
       </w:pPr>
       <w:r>
-        <w:t xml:space="preserve">86972 - Aquere, </w:t>
-      </w:r>
-      <w:proofErr w:type="spellStart"/>
-      <w:r>
-        <w:t>Agustin</w:t>
-      </w:r>
-      <w:proofErr w:type="spellEnd"/>
-      <w:r>
-        <w:t xml:space="preserve"> </w:t>
+        <w:t xml:space="preserve">86972 - Aquere, Agustin </w:t>
       </w:r>
     </w:p>
     <w:p>
@@ -333,7 +325,15 @@
       </w:r>
       <w:proofErr w:type="spellEnd"/>
       <w:r>
-        <w:t xml:space="preserve"> Contarino, Nicolas </w:t>
+        <w:t xml:space="preserve"> </w:t>
+      </w:r>
+      <w:proofErr w:type="spellStart"/>
+      <w:r>
+        <w:t>Contarino</w:t>
+      </w:r>
+      <w:proofErr w:type="spellEnd"/>
+      <w:r>
+        <w:t xml:space="preserve">, Nicolas </w:t>
       </w:r>
     </w:p>
     <w:p>
@@ -357,15 +357,7 @@
         </w:numPr>
       </w:pPr>
       <w:r>
-        <w:t xml:space="preserve">87360 - de Llamas, </w:t>
-      </w:r>
-      <w:proofErr w:type="spellStart"/>
-      <w:r>
-        <w:t>Agustin</w:t>
-      </w:r>
-      <w:proofErr w:type="spellEnd"/>
-      <w:r>
-        <w:t xml:space="preserve"> </w:t>
+        <w:t xml:space="preserve">87360 - de Llamas, Agustin </w:t>
       </w:r>
     </w:p>
     <w:p>
@@ -1124,6 +1116,19 @@
                 <w:lang w:val="es-ES"/>
               </w:rPr>
             </w:pPr>
+            <w:r>
+              <w:rPr>
+                <w:lang w:val="es-ES"/>
+              </w:rPr>
+              <w:t>Practico</w:t>
+            </w:r>
+          </w:p>
+          <w:p>
+            <w:pPr>
+              <w:rPr>
+                <w:lang w:val="es-ES"/>
+              </w:rPr>
+            </w:pPr>
           </w:p>
         </w:tc>
       </w:tr>
@@ -1734,6 +1739,12 @@
                 <w:lang w:val="es-ES"/>
               </w:rPr>
               <w:t>/</w:t>
+            </w:r>
+            <w:r>
+              <w:rPr>
+                <w:lang w:val="es-ES"/>
+              </w:rPr>
+              <w:t>04_Materiales Adicionales/Catedra</w:t>
             </w:r>
           </w:p>
         </w:tc>
@@ -2408,7 +2419,7 @@
 </file>
 
 <file path=word/numbering.xml><?xml version="1.0" encoding="utf-8"?>
-<w:numbering xmlns:wpc="http://schemas.microsoft.com/office/word/2010/wordprocessingCanvas" xmlns:cx="http://schemas.microsoft.com/office/drawing/2014/chartex" xmlns:cx1="http://schemas.microsoft.com/office/drawing/2015/9/8/chartex" xmlns:cx2="http://schemas.microsoft.com/office/drawing/2015/10/21/chartex" xmlns:cx3="http://schemas.microsoft.com/office/drawing/2016/5/9/chartex" xmlns:cx4="http://schemas.microsoft.com/office/drawing/2016/5/10/chartex" xmlns:cx5="http://schemas.microsoft.com/office/drawing/2016/5/11/chartex" xmlns:cx6="http://schemas.microsoft.com/office/drawing/2016/5/12/chartex" xmlns:cx7="http://schemas.microsoft.com/office/drawing/2016/5/13/chartex" xmlns:cx8="http://schemas.microsoft.com/office/drawing/2016/5/14/chartex" xmlns:mc="http://schemas.openxmlformats.org/markup-compatibility/2006" xmlns:aink="http://schemas.microsoft.com/office/drawing/2016/ink" xmlns:am3d="http://schemas.microsoft.com/office/drawing/2017/model3d" xmlns:o="urn:schemas-microsoft-com:office:office" xmlns:oel="http://schemas.microsoft.com/office/2019/extlst" xmlns:r="http://schemas.openxmlformats.org/officeDocument/2006/relationships" xmlns:m="http://schemas.openxmlformats.org/officeDocument/2006/math" xmlns:v="urn:schemas-microsoft-com:vml" xmlns:wp14="http://schemas.microsoft.com/office/word/2010/wordprocessingDrawing" xmlns:wp="http://schemas.openxmlformats.org/drawingml/2006/wordprocessingDrawing" xmlns:w10="urn:schemas-microsoft-com:office:word" xmlns:w="http://schemas.openxmlformats.org/wordprocessingml/2006/main" xmlns:w14="http://schemas.microsoft.com/office/word/2010/wordml" xmlns:w15="http://schemas.microsoft.com/office/word/2012/wordml" xmlns:w16cex="http://schemas.microsoft.com/office/word/2018/wordml/cex" xmlns:w16cid="http://schemas.microsoft.com/office/word/2016/wordml/cid" xmlns:w16="http://schemas.microsoft.com/office/word/2018/wordml" xmlns:w16du="http://schemas.microsoft.com/office/word/2023/wordml/word16du" xmlns:w16sdtdh="http://schemas.microsoft.com/office/word/2020/wordml/sdtdatahash" xmlns:w16sdtfl="http://schemas.microsoft.com/office/word/2024/wordml/sdtformatlock" xmlns:w16se="http://schemas.microsoft.com/office/word/2015/wordml/symex" xmlns:wpg="http://schemas.microsoft.com/office/word/2010/wordprocessingGroup" xmlns:wpi="http://schemas.microsoft.com/office/word/2010/wordprocessingInk" xmlns:wne="http://schemas.microsoft.com/office/word/2006/wordml" xmlns:wps="http://schemas.microsoft.com/office/word/2010/wordprocessingShape" mc:Ignorable="w14 w15 w16se w16cid w16 w16cex w16sdtdh w16sdtfl w16du wp14">
+<w:numbering xmlns:wpc="http://schemas.microsoft.com/office/word/2010/wordprocessingCanvas" xmlns:cx="http://schemas.microsoft.com/office/drawing/2014/chartex" xmlns:cx1="http://schemas.microsoft.com/office/drawing/2015/9/8/chartex" xmlns:cx2="http://schemas.microsoft.com/office/drawing/2015/10/21/chartex" xmlns:cx3="http://schemas.microsoft.com/office/drawing/2016/5/9/chartex" xmlns:cx4="http://schemas.microsoft.com/office/drawing/2016/5/10/chartex" xmlns:cx5="http://schemas.microsoft.com/office/drawing/2016/5/11/chartex" xmlns:cx6="http://schemas.microsoft.com/office/drawing/2016/5/12/chartex" xmlns:cx7="http://schemas.microsoft.com/office/drawing/2016/5/13/chartex" xmlns:cx8="http://schemas.microsoft.com/office/drawing/2016/5/14/chartex" xmlns:mc="http://schemas.openxmlformats.org/markup-compatibility/2006" xmlns:aink="http://schemas.microsoft.com/office/drawing/2016/ink" xmlns:am3d="http://schemas.microsoft.com/office/drawing/2017/model3d" xmlns:o="urn:schemas-microsoft-com:office:office" xmlns:oel="http://schemas.microsoft.com/office/2019/extlst" xmlns:r="http://schemas.openxmlformats.org/officeDocument/2006/relationships" xmlns:m="http://schemas.openxmlformats.org/officeDocument/2006/math" xmlns:v="urn:schemas-microsoft-com:vml" xmlns:wp14="http://schemas.microsoft.com/office/word/2010/wordprocessingDrawing" xmlns:wp="http://schemas.openxmlformats.org/drawingml/2006/wordprocessingDrawing" xmlns:w10="urn:schemas-microsoft-com:office:word" xmlns:w="http://schemas.openxmlformats.org/wordprocessingml/2006/main" xmlns:w14="http://schemas.microsoft.com/office/word/2010/wordml" xmlns:w15="http://schemas.microsoft.com/office/word/2012/wordml" xmlns:w16cex="http://schemas.microsoft.com/office/word/2018/wordml/cex" xmlns:w16cid="http://schemas.microsoft.com/office/word/2016/wordml/cid" xmlns:w16="http://schemas.microsoft.com/office/word/2018/wordml" xmlns:w16sdtdh="http://schemas.microsoft.com/office/word/2020/wordml/sdtdatahash" xmlns:w16se="http://schemas.microsoft.com/office/word/2015/wordml/symex" xmlns:wpg="http://schemas.microsoft.com/office/word/2010/wordprocessingGroup" xmlns:wpi="http://schemas.microsoft.com/office/word/2010/wordprocessingInk" xmlns:wne="http://schemas.microsoft.com/office/word/2006/wordml" xmlns:wps="http://schemas.microsoft.com/office/word/2010/wordprocessingShape" mc:Ignorable="w14 w15 w16se w16cid w16 w16cex w16sdtdh wp14">
   <w:abstractNum w:abstractNumId="0" w15:restartNumberingAfterBreak="0">
     <w:nsid w:val="2BF87154"/>
     <w:multiLevelType w:val="multilevel"/>
@@ -2675,7 +2686,7 @@
 </file>
 
 <file path=word/styles.xml><?xml version="1.0" encoding="utf-8"?>
-<w:styles xmlns:mc="http://schemas.openxmlformats.org/markup-compatibility/2006" xmlns:r="http://schemas.openxmlformats.org/officeDocument/2006/relationships" xmlns:w="http://schemas.openxmlformats.org/wordprocessingml/2006/main" xmlns:w14="http://schemas.microsoft.com/office/word/2010/wordml" xmlns:w15="http://schemas.microsoft.com/office/word/2012/wordml" xmlns:w16cex="http://schemas.microsoft.com/office/word/2018/wordml/cex" xmlns:w16cid="http://schemas.microsoft.com/office/word/2016/wordml/cid" xmlns:w16="http://schemas.microsoft.com/office/word/2018/wordml" xmlns:w16du="http://schemas.microsoft.com/office/word/2023/wordml/word16du" xmlns:w16sdtdh="http://schemas.microsoft.com/office/word/2020/wordml/sdtdatahash" xmlns:w16sdtfl="http://schemas.microsoft.com/office/word/2024/wordml/sdtformatlock" xmlns:w16se="http://schemas.microsoft.com/office/word/2015/wordml/symex" mc:Ignorable="w14 w15 w16se w16cid w16 w16cex w16sdtdh w16sdtfl w16du">
+<w:styles xmlns:mc="http://schemas.openxmlformats.org/markup-compatibility/2006" xmlns:r="http://schemas.openxmlformats.org/officeDocument/2006/relationships" xmlns:w="http://schemas.openxmlformats.org/wordprocessingml/2006/main" xmlns:w14="http://schemas.microsoft.com/office/word/2010/wordml" xmlns:w15="http://schemas.microsoft.com/office/word/2012/wordml" xmlns:w16cex="http://schemas.microsoft.com/office/word/2018/wordml/cex" xmlns:w16cid="http://schemas.microsoft.com/office/word/2016/wordml/cid" xmlns:w16="http://schemas.microsoft.com/office/word/2018/wordml" xmlns:w16sdtdh="http://schemas.microsoft.com/office/word/2020/wordml/sdtdatahash" xmlns:w16se="http://schemas.microsoft.com/office/word/2015/wordml/symex" mc:Ignorable="w14 w15 w16se w16cid w16 w16cex w16sdtdh">
   <w:docDefaults>
     <w:rPrDefault>
       <w:rPr>

</xml_diff>

<commit_message>
Se agrego la estructura del repositorio a la gestion de configuracion
</commit_message>
<xml_diff>
--- a/01_Gestion de configuracion/DOC_Reglas_SCM_v1.docx
+++ b/01_Gestion de configuracion/DOC_Reglas_SCM_v1.docx
@@ -390,6 +390,157 @@
           <w:lang w:val="es-ES"/>
         </w:rPr>
         <w:lastRenderedPageBreak/>
+        <w:t>Estructura Repositorio</w:t>
+      </w:r>
+    </w:p>
+    <w:p>
+      <w:pPr>
+        <w:rPr>
+          <w:lang w:val="es-ES"/>
+        </w:rPr>
+      </w:pPr>
+    </w:p>
+    <w:p>
+      <w:pPr>
+        <w:rPr>
+          <w:lang w:val="es-ES"/>
+        </w:rPr>
+      </w:pPr>
+      <w:r>
+        <w:rPr>
+          <w:noProof/>
+          <w:lang w:val="es-ES"/>
+        </w:rPr>
+        <w:drawing>
+          <wp:inline distT="0" distB="0" distL="0" distR="0" wp14:anchorId="21F2B9FB" wp14:editId="1FF55056">
+            <wp:extent cx="6212778" cy="4972050"/>
+            <wp:effectExtent l="0" t="0" r="0" b="0"/>
+            <wp:docPr id="2" name="Imagen 2"/>
+            <wp:cNvGraphicFramePr>
+              <a:graphicFrameLocks xmlns:a="http://schemas.openxmlformats.org/drawingml/2006/main" noChangeAspect="1"/>
+            </wp:cNvGraphicFramePr>
+            <a:graphic xmlns:a="http://schemas.openxmlformats.org/drawingml/2006/main">
+              <a:graphicData uri="http://schemas.openxmlformats.org/drawingml/2006/picture">
+                <pic:pic xmlns:pic="http://schemas.openxmlformats.org/drawingml/2006/picture">
+                  <pic:nvPicPr>
+                    <pic:cNvPr id="2" name="Imagen 2"/>
+                    <pic:cNvPicPr/>
+                  </pic:nvPicPr>
+                  <pic:blipFill>
+                    <a:blip r:embed="rId6">
+                      <a:extLst>
+                        <a:ext uri="{28A0092B-C50C-407E-A947-70E740481C1C}">
+                          <a14:useLocalDpi xmlns:a14="http://schemas.microsoft.com/office/drawing/2010/main" val="0"/>
+                        </a:ext>
+                      </a:extLst>
+                    </a:blip>
+                    <a:stretch>
+                      <a:fillRect/>
+                    </a:stretch>
+                  </pic:blipFill>
+                  <pic:spPr>
+                    <a:xfrm>
+                      <a:off x="0" y="0"/>
+                      <a:ext cx="6214701" cy="4973589"/>
+                    </a:xfrm>
+                    <a:prstGeom prst="rect">
+                      <a:avLst/>
+                    </a:prstGeom>
+                  </pic:spPr>
+                </pic:pic>
+              </a:graphicData>
+            </a:graphic>
+          </wp:inline>
+        </w:drawing>
+      </w:r>
+    </w:p>
+    <w:p>
+      <w:pPr>
+        <w:rPr>
+          <w:lang w:val="es-ES"/>
+        </w:rPr>
+      </w:pPr>
+    </w:p>
+    <w:p>
+      <w:pPr>
+        <w:rPr>
+          <w:lang w:val="es-ES"/>
+        </w:rPr>
+      </w:pPr>
+    </w:p>
+    <w:p>
+      <w:pPr>
+        <w:rPr>
+          <w:lang w:val="es-ES"/>
+        </w:rPr>
+      </w:pPr>
+    </w:p>
+    <w:p>
+      <w:pPr>
+        <w:rPr>
+          <w:lang w:val="es-ES"/>
+        </w:rPr>
+      </w:pPr>
+    </w:p>
+    <w:p>
+      <w:pPr>
+        <w:rPr>
+          <w:lang w:val="es-ES"/>
+        </w:rPr>
+      </w:pPr>
+    </w:p>
+    <w:p>
+      <w:pPr>
+        <w:rPr>
+          <w:lang w:val="es-ES"/>
+        </w:rPr>
+      </w:pPr>
+    </w:p>
+    <w:p>
+      <w:pPr>
+        <w:rPr>
+          <w:lang w:val="es-ES"/>
+        </w:rPr>
+      </w:pPr>
+    </w:p>
+    <w:p>
+      <w:pPr>
+        <w:rPr>
+          <w:lang w:val="es-ES"/>
+        </w:rPr>
+      </w:pPr>
+    </w:p>
+    <w:p>
+      <w:pPr>
+        <w:rPr>
+          <w:lang w:val="es-ES"/>
+        </w:rPr>
+      </w:pPr>
+    </w:p>
+    <w:p>
+      <w:pPr>
+        <w:rPr>
+          <w:lang w:val="es-ES"/>
+        </w:rPr>
+      </w:pPr>
+    </w:p>
+    <w:p>
+      <w:pPr>
+        <w:rPr>
+          <w:lang w:val="es-ES"/>
+        </w:rPr>
+      </w:pPr>
+    </w:p>
+    <w:p>
+      <w:pPr>
+        <w:rPr>
+          <w:lang w:val="es-ES"/>
+        </w:rPr>
+      </w:pPr>
+      <w:r>
+        <w:rPr>
+          <w:lang w:val="es-ES"/>
+        </w:rPr>
         <w:t>Tabla de Ítems de Configuración</w:t>
       </w:r>
     </w:p>
@@ -612,13 +763,27 @@
               <w:rPr>
                 <w:lang w:val="es-ES"/>
               </w:rPr>
-              <w:t>_&lt;Nombre Libro&gt;</w:t>
-            </w:r>
-            <w:r>
-              <w:rPr>
-                <w:lang w:val="es-ES"/>
-              </w:rPr>
-              <w:t>.&lt;Extensión&gt;</w:t>
+              <w:t>_&lt;Nombre Libro</w:t>
+            </w:r>
+            <w:proofErr w:type="gramStart"/>
+            <w:r>
+              <w:rPr>
+                <w:lang w:val="es-ES"/>
+              </w:rPr>
+              <w:t>&gt;</w:t>
+            </w:r>
+            <w:r>
+              <w:rPr>
+                <w:lang w:val="es-ES"/>
+              </w:rPr>
+              <w:t>.&lt;</w:t>
+            </w:r>
+            <w:proofErr w:type="gramEnd"/>
+            <w:r>
+              <w:rPr>
+                <w:lang w:val="es-ES"/>
+              </w:rPr>
+              <w:t>Extensión&gt;</w:t>
             </w:r>
           </w:p>
         </w:tc>
@@ -761,7 +926,14 @@
               <w:rPr>
                 <w:lang w:val="es-ES"/>
               </w:rPr>
-              <w:t>_Tema&gt;</w:t>
+              <w:t>_Tema</w:t>
+            </w:r>
+            <w:proofErr w:type="gramStart"/>
+            <w:r>
+              <w:rPr>
+                <w:lang w:val="es-ES"/>
+              </w:rPr>
+              <w:t>&gt;</w:t>
             </w:r>
             <w:r>
               <w:rPr>
@@ -770,6 +942,7 @@
               <w:t>.&lt;</w:t>
             </w:r>
             <w:proofErr w:type="spellStart"/>
+            <w:proofErr w:type="gramEnd"/>
             <w:r>
               <w:rPr>
                 <w:lang w:val="es-ES"/>
@@ -1208,9 +1381,17 @@
               <w:rPr>
                 <w:lang w:val="es-ES"/>
               </w:rPr>
-              <w:t xml:space="preserve"> &gt;.&lt;</w:t>
+              <w:t xml:space="preserve"> </w:t>
+            </w:r>
+            <w:proofErr w:type="gramStart"/>
+            <w:r>
+              <w:rPr>
+                <w:lang w:val="es-ES"/>
+              </w:rPr>
+              <w:t>&gt;.&lt;</w:t>
             </w:r>
             <w:proofErr w:type="spellStart"/>
+            <w:proofErr w:type="gramEnd"/>
             <w:r>
               <w:rPr>
                 <w:lang w:val="es-ES"/>
@@ -1416,6 +1597,7 @@
               <w:t>version</w:t>
             </w:r>
             <w:proofErr w:type="spellEnd"/>
+            <w:proofErr w:type="gramStart"/>
             <w:r>
               <w:rPr>
                 <w:lang w:val="es-ES"/>
@@ -1423,6 +1605,7 @@
               <w:t>&gt;.&lt;</w:t>
             </w:r>
             <w:proofErr w:type="spellStart"/>
+            <w:proofErr w:type="gramEnd"/>
             <w:r>
               <w:rPr>
                 <w:lang w:val="es-ES"/>
@@ -1663,6 +1846,7 @@
               <w:rPr>
                 <w:lang w:val="es-ES"/>
               </w:rPr>
+              <w:lastRenderedPageBreak/>
               <w:t>Programa de la asign</w:t>
             </w:r>
             <w:r>
@@ -3288,7 +3472,6 @@
   <w:style w:type="character" w:default="1" w:styleId="Fuentedeprrafopredeter">
     <w:name w:val="Default Paragraph Font"/>
     <w:uiPriority w:val="1"/>
-    <w:semiHidden/>
     <w:unhideWhenUsed/>
   </w:style>
   <w:style w:type="table" w:default="1" w:styleId="Tablanormal">

</xml_diff>

<commit_message>
presentación gestion de configuración
</commit_message>
<xml_diff>
--- a/01_Gestion de configuracion/DOC_Reglas_SCM_v1.docx
+++ b/01_Gestion de configuracion/DOC_Reglas_SCM_v1.docx
@@ -1,6 +1,6 @@
 
 <file path=word/document.xml><?xml version="1.0" encoding="utf-8"?>
-<w:document xmlns:wpc="http://schemas.microsoft.com/office/word/2010/wordprocessingCanvas" xmlns:cx="http://schemas.microsoft.com/office/drawing/2014/chartex" xmlns:cx1="http://schemas.microsoft.com/office/drawing/2015/9/8/chartex" xmlns:cx2="http://schemas.microsoft.com/office/drawing/2015/10/21/chartex" xmlns:cx3="http://schemas.microsoft.com/office/drawing/2016/5/9/chartex" xmlns:cx4="http://schemas.microsoft.com/office/drawing/2016/5/10/chartex" xmlns:cx5="http://schemas.microsoft.com/office/drawing/2016/5/11/chartex" xmlns:cx6="http://schemas.microsoft.com/office/drawing/2016/5/12/chartex" xmlns:cx7="http://schemas.microsoft.com/office/drawing/2016/5/13/chartex" xmlns:cx8="http://schemas.microsoft.com/office/drawing/2016/5/14/chartex" xmlns:mc="http://schemas.openxmlformats.org/markup-compatibility/2006" xmlns:aink="http://schemas.microsoft.com/office/drawing/2016/ink" xmlns:am3d="http://schemas.microsoft.com/office/drawing/2017/model3d" xmlns:o="urn:schemas-microsoft-com:office:office" xmlns:oel="http://schemas.microsoft.com/office/2019/extlst" xmlns:r="http://schemas.openxmlformats.org/officeDocument/2006/relationships" xmlns:m="http://schemas.openxmlformats.org/officeDocument/2006/math" xmlns:v="urn:schemas-microsoft-com:vml" xmlns:wp14="http://schemas.microsoft.com/office/word/2010/wordprocessingDrawing" xmlns:wp="http://schemas.openxmlformats.org/drawingml/2006/wordprocessingDrawing" xmlns:w10="urn:schemas-microsoft-com:office:word" xmlns:w="http://schemas.openxmlformats.org/wordprocessingml/2006/main" xmlns:w14="http://schemas.microsoft.com/office/word/2010/wordml" xmlns:w15="http://schemas.microsoft.com/office/word/2012/wordml" xmlns:w16cex="http://schemas.microsoft.com/office/word/2018/wordml/cex" xmlns:w16cid="http://schemas.microsoft.com/office/word/2016/wordml/cid" xmlns:w16="http://schemas.microsoft.com/office/word/2018/wordml" xmlns:w16sdtdh="http://schemas.microsoft.com/office/word/2020/wordml/sdtdatahash" xmlns:w16se="http://schemas.microsoft.com/office/word/2015/wordml/symex" xmlns:wpg="http://schemas.microsoft.com/office/word/2010/wordprocessingGroup" xmlns:wpi="http://schemas.microsoft.com/office/word/2010/wordprocessingInk" xmlns:wne="http://schemas.microsoft.com/office/word/2006/wordml" xmlns:wps="http://schemas.microsoft.com/office/word/2010/wordprocessingShape" mc:Ignorable="w14 w15 w16se w16cid w16 w16cex w16sdtdh wp14">
+<w:document xmlns:wpc="http://schemas.microsoft.com/office/word/2010/wordprocessingCanvas" xmlns:cx="http://schemas.microsoft.com/office/drawing/2014/chartex" xmlns:cx1="http://schemas.microsoft.com/office/drawing/2015/9/8/chartex" xmlns:cx2="http://schemas.microsoft.com/office/drawing/2015/10/21/chartex" xmlns:cx3="http://schemas.microsoft.com/office/drawing/2016/5/9/chartex" xmlns:cx4="http://schemas.microsoft.com/office/drawing/2016/5/10/chartex" xmlns:cx5="http://schemas.microsoft.com/office/drawing/2016/5/11/chartex" xmlns:cx6="http://schemas.microsoft.com/office/drawing/2016/5/12/chartex" xmlns:cx7="http://schemas.microsoft.com/office/drawing/2016/5/13/chartex" xmlns:cx8="http://schemas.microsoft.com/office/drawing/2016/5/14/chartex" xmlns:mc="http://schemas.openxmlformats.org/markup-compatibility/2006" xmlns:aink="http://schemas.microsoft.com/office/drawing/2016/ink" xmlns:am3d="http://schemas.microsoft.com/office/drawing/2017/model3d" xmlns:o="urn:schemas-microsoft-com:office:office" xmlns:oel="http://schemas.microsoft.com/office/2019/extlst" xmlns:r="http://schemas.openxmlformats.org/officeDocument/2006/relationships" xmlns:m="http://schemas.openxmlformats.org/officeDocument/2006/math" xmlns:v="urn:schemas-microsoft-com:vml" xmlns:wp14="http://schemas.microsoft.com/office/word/2010/wordprocessingDrawing" xmlns:wp="http://schemas.openxmlformats.org/drawingml/2006/wordprocessingDrawing" xmlns:w10="urn:schemas-microsoft-com:office:word" xmlns:w="http://schemas.openxmlformats.org/wordprocessingml/2006/main" xmlns:w14="http://schemas.microsoft.com/office/word/2010/wordml" xmlns:w15="http://schemas.microsoft.com/office/word/2012/wordml" xmlns:w16cex="http://schemas.microsoft.com/office/word/2018/wordml/cex" xmlns:w16cid="http://schemas.microsoft.com/office/word/2016/wordml/cid" xmlns:w16="http://schemas.microsoft.com/office/word/2018/wordml" xmlns:w16du="http://schemas.microsoft.com/office/word/2023/wordml/word16du" xmlns:w16sdtdh="http://schemas.microsoft.com/office/word/2020/wordml/sdtdatahash" xmlns:w16sdtfl="http://schemas.microsoft.com/office/word/2024/wordml/sdtformatlock" xmlns:w16se="http://schemas.microsoft.com/office/word/2015/wordml/symex" xmlns:wpg="http://schemas.microsoft.com/office/word/2010/wordprocessingGroup" xmlns:wpi="http://schemas.microsoft.com/office/word/2010/wordprocessingInk" xmlns:wne="http://schemas.microsoft.com/office/word/2006/wordml" xmlns:wps="http://schemas.microsoft.com/office/word/2010/wordprocessingShape" mc:Ignorable="w14 w15 w16se w16cid w16 w16cex w16sdtdh w16sdtfl w16du wp14">
   <w:body>
     <w:p>
       <w:pPr>
@@ -325,15 +325,7 @@
       </w:r>
       <w:proofErr w:type="spellEnd"/>
       <w:r>
-        <w:t xml:space="preserve"> </w:t>
-      </w:r>
-      <w:proofErr w:type="spellStart"/>
-      <w:r>
-        <w:t>Contarino</w:t>
-      </w:r>
-      <w:proofErr w:type="spellEnd"/>
-      <w:r>
-        <w:t xml:space="preserve">, Nicolas </w:t>
+        <w:t xml:space="preserve"> Contarino, Nicolas </w:t>
       </w:r>
     </w:p>
     <w:p>
@@ -516,31 +508,11 @@
           <w:lang w:val="es-ES"/>
         </w:rPr>
       </w:pPr>
-    </w:p>
-    <w:p>
-      <w:pPr>
+      <w:r>
         <w:rPr>
           <w:lang w:val="es-ES"/>
         </w:rPr>
-      </w:pPr>
-    </w:p>
-    <w:p>
-      <w:pPr>
-        <w:rPr>
-          <w:lang w:val="es-ES"/>
-        </w:rPr>
-      </w:pPr>
-    </w:p>
-    <w:p>
-      <w:pPr>
-        <w:rPr>
-          <w:lang w:val="es-ES"/>
-        </w:rPr>
-      </w:pPr>
-      <w:r>
-        <w:rPr>
-          <w:lang w:val="es-ES"/>
-        </w:rPr>
+        <w:lastRenderedPageBreak/>
         <w:t>Tabla de Ítems de Configuración</w:t>
       </w:r>
     </w:p>
@@ -763,27 +735,13 @@
               <w:rPr>
                 <w:lang w:val="es-ES"/>
               </w:rPr>
-              <w:t>_&lt;Nombre Libro</w:t>
-            </w:r>
-            <w:proofErr w:type="gramStart"/>
-            <w:r>
-              <w:rPr>
-                <w:lang w:val="es-ES"/>
-              </w:rPr>
-              <w:t>&gt;</w:t>
-            </w:r>
-            <w:r>
-              <w:rPr>
-                <w:lang w:val="es-ES"/>
-              </w:rPr>
-              <w:t>.&lt;</w:t>
-            </w:r>
-            <w:proofErr w:type="gramEnd"/>
-            <w:r>
-              <w:rPr>
-                <w:lang w:val="es-ES"/>
-              </w:rPr>
-              <w:t>Extensión&gt;</w:t>
+              <w:t>_&lt;Nombre Libro&gt;</w:t>
+            </w:r>
+            <w:r>
+              <w:rPr>
+                <w:lang w:val="es-ES"/>
+              </w:rPr>
+              <w:t>.&lt;Extensión&gt;</w:t>
             </w:r>
           </w:p>
         </w:tc>
@@ -926,14 +884,7 @@
               <w:rPr>
                 <w:lang w:val="es-ES"/>
               </w:rPr>
-              <w:t>_Tema</w:t>
-            </w:r>
-            <w:proofErr w:type="gramStart"/>
-            <w:r>
-              <w:rPr>
-                <w:lang w:val="es-ES"/>
-              </w:rPr>
-              <w:t>&gt;</w:t>
+              <w:t>_Tema&gt;</w:t>
             </w:r>
             <w:r>
               <w:rPr>
@@ -942,7 +893,6 @@
               <w:t>.&lt;</w:t>
             </w:r>
             <w:proofErr w:type="spellStart"/>
-            <w:proofErr w:type="gramEnd"/>
             <w:r>
               <w:rPr>
                 <w:lang w:val="es-ES"/>
@@ -1381,17 +1331,9 @@
               <w:rPr>
                 <w:lang w:val="es-ES"/>
               </w:rPr>
-              <w:t xml:space="preserve"> </w:t>
-            </w:r>
-            <w:proofErr w:type="gramStart"/>
-            <w:r>
-              <w:rPr>
-                <w:lang w:val="es-ES"/>
-              </w:rPr>
-              <w:t>&gt;.&lt;</w:t>
+              <w:t xml:space="preserve"> &gt;.&lt;</w:t>
             </w:r>
             <w:proofErr w:type="spellStart"/>
-            <w:proofErr w:type="gramEnd"/>
             <w:r>
               <w:rPr>
                 <w:lang w:val="es-ES"/>
@@ -1597,7 +1539,6 @@
               <w:t>version</w:t>
             </w:r>
             <w:proofErr w:type="spellEnd"/>
-            <w:proofErr w:type="gramStart"/>
             <w:r>
               <w:rPr>
                 <w:lang w:val="es-ES"/>
@@ -1605,7 +1546,6 @@
               <w:t>&gt;.&lt;</w:t>
             </w:r>
             <w:proofErr w:type="spellStart"/>
-            <w:proofErr w:type="gramEnd"/>
             <w:r>
               <w:rPr>
                 <w:lang w:val="es-ES"/>
@@ -1846,7 +1786,6 @@
               <w:rPr>
                 <w:lang w:val="es-ES"/>
               </w:rPr>
-              <w:lastRenderedPageBreak/>
               <w:t>Programa de la asign</w:t>
             </w:r>
             <w:r>
@@ -1964,113 +1903,7 @@
           </w:p>
         </w:tc>
       </w:tr>
-      <w:tr>
-        <w:tc>
-          <w:tcPr>
-            <w:tcW w:w="2235" w:type="dxa"/>
-            <w:tcBorders>
-              <w:top w:val="single" w:sz="8" w:space="0" w:color="000000"/>
-              <w:left w:val="single" w:sz="8" w:space="0" w:color="000000"/>
-              <w:bottom w:val="single" w:sz="8" w:space="0" w:color="000000"/>
-              <w:right w:val="single" w:sz="8" w:space="0" w:color="000000"/>
-            </w:tcBorders>
-            <w:tcMar>
-              <w:top w:w="100" w:type="dxa"/>
-              <w:left w:w="100" w:type="dxa"/>
-              <w:bottom w:w="100" w:type="dxa"/>
-              <w:right w:w="100" w:type="dxa"/>
-            </w:tcMar>
-            <w:hideMark/>
-          </w:tcPr>
-          <w:p>
-            <w:pPr>
-              <w:rPr>
-                <w:lang w:val="es-ES"/>
-              </w:rPr>
-            </w:pPr>
-          </w:p>
-        </w:tc>
-        <w:tc>
-          <w:tcPr>
-            <w:tcW w:w="2433" w:type="dxa"/>
-            <w:tcBorders>
-              <w:top w:val="single" w:sz="8" w:space="0" w:color="000000"/>
-              <w:left w:val="single" w:sz="8" w:space="0" w:color="000000"/>
-              <w:bottom w:val="single" w:sz="8" w:space="0" w:color="000000"/>
-              <w:right w:val="single" w:sz="8" w:space="0" w:color="000000"/>
-            </w:tcBorders>
-            <w:tcMar>
-              <w:top w:w="100" w:type="dxa"/>
-              <w:left w:w="100" w:type="dxa"/>
-              <w:bottom w:w="100" w:type="dxa"/>
-              <w:right w:w="100" w:type="dxa"/>
-            </w:tcMar>
-            <w:hideMark/>
-          </w:tcPr>
-          <w:p>
-            <w:pPr>
-              <w:rPr>
-                <w:lang w:val="es-ES"/>
-              </w:rPr>
-            </w:pPr>
-          </w:p>
-        </w:tc>
-        <w:tc>
-          <w:tcPr>
-            <w:tcW w:w="2082" w:type="dxa"/>
-            <w:tcBorders>
-              <w:top w:val="single" w:sz="8" w:space="0" w:color="000000"/>
-              <w:left w:val="single" w:sz="8" w:space="0" w:color="000000"/>
-              <w:bottom w:val="single" w:sz="8" w:space="0" w:color="000000"/>
-              <w:right w:val="single" w:sz="8" w:space="0" w:color="000000"/>
-            </w:tcBorders>
-            <w:tcMar>
-              <w:top w:w="100" w:type="dxa"/>
-              <w:left w:w="100" w:type="dxa"/>
-              <w:bottom w:w="100" w:type="dxa"/>
-              <w:right w:w="100" w:type="dxa"/>
-            </w:tcMar>
-            <w:hideMark/>
-          </w:tcPr>
-          <w:p>
-            <w:pPr>
-              <w:rPr>
-                <w:lang w:val="es-ES"/>
-              </w:rPr>
-            </w:pPr>
-          </w:p>
-        </w:tc>
-        <w:tc>
-          <w:tcPr>
-            <w:tcW w:w="2190" w:type="dxa"/>
-            <w:tcBorders>
-              <w:top w:val="single" w:sz="8" w:space="0" w:color="000000"/>
-              <w:left w:val="single" w:sz="8" w:space="0" w:color="000000"/>
-              <w:bottom w:val="single" w:sz="8" w:space="0" w:color="000000"/>
-              <w:right w:val="single" w:sz="8" w:space="0" w:color="000000"/>
-            </w:tcBorders>
-            <w:tcMar>
-              <w:top w:w="100" w:type="dxa"/>
-              <w:left w:w="100" w:type="dxa"/>
-              <w:bottom w:w="100" w:type="dxa"/>
-              <w:right w:w="100" w:type="dxa"/>
-            </w:tcMar>
-            <w:hideMark/>
-          </w:tcPr>
-          <w:p>
-            <w:pPr>
-              <w:rPr>
-                <w:lang w:val="es-ES"/>
-              </w:rPr>
-            </w:pPr>
-          </w:p>
-        </w:tc>
-      </w:tr>
     </w:tbl>
-    <w:p/>
-    <w:p/>
-    <w:p/>
-    <w:p/>
     <w:p/>
     <w:p/>
     <w:p/>
@@ -2501,96 +2334,6 @@
           </w:p>
         </w:tc>
       </w:tr>
-      <w:tr>
-        <w:trPr>
-          <w:tblCellSpacing w:w="15" w:type="dxa"/>
-        </w:trPr>
-        <w:tc>
-          <w:tcPr>
-            <w:tcW w:w="0" w:type="auto"/>
-            <w:tcBorders>
-              <w:top w:val="single" w:sz="6" w:space="0" w:color="C4C7C5"/>
-              <w:left w:val="single" w:sz="6" w:space="0" w:color="C4C7C5"/>
-              <w:bottom w:val="single" w:sz="6" w:space="0" w:color="C4C7C5"/>
-              <w:right w:val="single" w:sz="6" w:space="0" w:color="C4C7C5"/>
-            </w:tcBorders>
-            <w:tcMar>
-              <w:top w:w="120" w:type="dxa"/>
-              <w:left w:w="180" w:type="dxa"/>
-              <w:bottom w:w="120" w:type="dxa"/>
-              <w:right w:w="180" w:type="dxa"/>
-            </w:tcMar>
-            <w:vAlign w:val="center"/>
-            <w:hideMark/>
-          </w:tcPr>
-          <w:p/>
-        </w:tc>
-        <w:tc>
-          <w:tcPr>
-            <w:tcW w:w="0" w:type="auto"/>
-            <w:tcBorders>
-              <w:top w:val="single" w:sz="6" w:space="0" w:color="C4C7C5"/>
-              <w:left w:val="single" w:sz="6" w:space="0" w:color="C4C7C5"/>
-              <w:bottom w:val="single" w:sz="6" w:space="0" w:color="C4C7C5"/>
-              <w:right w:val="single" w:sz="6" w:space="0" w:color="C4C7C5"/>
-            </w:tcBorders>
-            <w:tcMar>
-              <w:top w:w="120" w:type="dxa"/>
-              <w:left w:w="180" w:type="dxa"/>
-              <w:bottom w:w="120" w:type="dxa"/>
-              <w:right w:w="180" w:type="dxa"/>
-            </w:tcMar>
-            <w:vAlign w:val="center"/>
-            <w:hideMark/>
-          </w:tcPr>
-          <w:p/>
-        </w:tc>
-      </w:tr>
-      <w:tr>
-        <w:trPr>
-          <w:tblCellSpacing w:w="15" w:type="dxa"/>
-        </w:trPr>
-        <w:tc>
-          <w:tcPr>
-            <w:tcW w:w="0" w:type="auto"/>
-            <w:tcBorders>
-              <w:top w:val="single" w:sz="6" w:space="0" w:color="C4C7C5"/>
-              <w:left w:val="single" w:sz="6" w:space="0" w:color="C4C7C5"/>
-              <w:bottom w:val="single" w:sz="6" w:space="0" w:color="C4C7C5"/>
-              <w:right w:val="single" w:sz="6" w:space="0" w:color="C4C7C5"/>
-            </w:tcBorders>
-            <w:tcMar>
-              <w:top w:w="120" w:type="dxa"/>
-              <w:left w:w="180" w:type="dxa"/>
-              <w:bottom w:w="120" w:type="dxa"/>
-              <w:right w:w="180" w:type="dxa"/>
-            </w:tcMar>
-            <w:vAlign w:val="center"/>
-            <w:hideMark/>
-          </w:tcPr>
-          <w:p/>
-        </w:tc>
-        <w:tc>
-          <w:tcPr>
-            <w:tcW w:w="0" w:type="auto"/>
-            <w:tcBorders>
-              <w:top w:val="single" w:sz="6" w:space="0" w:color="C4C7C5"/>
-              <w:left w:val="single" w:sz="6" w:space="0" w:color="C4C7C5"/>
-              <w:bottom w:val="single" w:sz="6" w:space="0" w:color="C4C7C5"/>
-              <w:right w:val="single" w:sz="6" w:space="0" w:color="C4C7C5"/>
-            </w:tcBorders>
-            <w:tcMar>
-              <w:top w:w="120" w:type="dxa"/>
-              <w:left w:w="180" w:type="dxa"/>
-              <w:bottom w:w="120" w:type="dxa"/>
-              <w:right w:w="180" w:type="dxa"/>
-            </w:tcMar>
-            <w:vAlign w:val="center"/>
-            <w:hideMark/>
-          </w:tcPr>
-          <w:p/>
-        </w:tc>
-      </w:tr>
     </w:tbl>
     <w:p/>
     <w:sectPr>
@@ -2603,7 +2346,7 @@
 </file>
 
 <file path=word/numbering.xml><?xml version="1.0" encoding="utf-8"?>
-<w:numbering xmlns:wpc="http://schemas.microsoft.com/office/word/2010/wordprocessingCanvas" xmlns:cx="http://schemas.microsoft.com/office/drawing/2014/chartex" xmlns:cx1="http://schemas.microsoft.com/office/drawing/2015/9/8/chartex" xmlns:cx2="http://schemas.microsoft.com/office/drawing/2015/10/21/chartex" xmlns:cx3="http://schemas.microsoft.com/office/drawing/2016/5/9/chartex" xmlns:cx4="http://schemas.microsoft.com/office/drawing/2016/5/10/chartex" xmlns:cx5="http://schemas.microsoft.com/office/drawing/2016/5/11/chartex" xmlns:cx6="http://schemas.microsoft.com/office/drawing/2016/5/12/chartex" xmlns:cx7="http://schemas.microsoft.com/office/drawing/2016/5/13/chartex" xmlns:cx8="http://schemas.microsoft.com/office/drawing/2016/5/14/chartex" xmlns:mc="http://schemas.openxmlformats.org/markup-compatibility/2006" xmlns:aink="http://schemas.microsoft.com/office/drawing/2016/ink" xmlns:am3d="http://schemas.microsoft.com/office/drawing/2017/model3d" xmlns:o="urn:schemas-microsoft-com:office:office" xmlns:oel="http://schemas.microsoft.com/office/2019/extlst" xmlns:r="http://schemas.openxmlformats.org/officeDocument/2006/relationships" xmlns:m="http://schemas.openxmlformats.org/officeDocument/2006/math" xmlns:v="urn:schemas-microsoft-com:vml" xmlns:wp14="http://schemas.microsoft.com/office/word/2010/wordprocessingDrawing" xmlns:wp="http://schemas.openxmlformats.org/drawingml/2006/wordprocessingDrawing" xmlns:w10="urn:schemas-microsoft-com:office:word" xmlns:w="http://schemas.openxmlformats.org/wordprocessingml/2006/main" xmlns:w14="http://schemas.microsoft.com/office/word/2010/wordml" xmlns:w15="http://schemas.microsoft.com/office/word/2012/wordml" xmlns:w16cex="http://schemas.microsoft.com/office/word/2018/wordml/cex" xmlns:w16cid="http://schemas.microsoft.com/office/word/2016/wordml/cid" xmlns:w16="http://schemas.microsoft.com/office/word/2018/wordml" xmlns:w16sdtdh="http://schemas.microsoft.com/office/word/2020/wordml/sdtdatahash" xmlns:w16se="http://schemas.microsoft.com/office/word/2015/wordml/symex" xmlns:wpg="http://schemas.microsoft.com/office/word/2010/wordprocessingGroup" xmlns:wpi="http://schemas.microsoft.com/office/word/2010/wordprocessingInk" xmlns:wne="http://schemas.microsoft.com/office/word/2006/wordml" xmlns:wps="http://schemas.microsoft.com/office/word/2010/wordprocessingShape" mc:Ignorable="w14 w15 w16se w16cid w16 w16cex w16sdtdh wp14">
+<w:numbering xmlns:wpc="http://schemas.microsoft.com/office/word/2010/wordprocessingCanvas" xmlns:cx="http://schemas.microsoft.com/office/drawing/2014/chartex" xmlns:cx1="http://schemas.microsoft.com/office/drawing/2015/9/8/chartex" xmlns:cx2="http://schemas.microsoft.com/office/drawing/2015/10/21/chartex" xmlns:cx3="http://schemas.microsoft.com/office/drawing/2016/5/9/chartex" xmlns:cx4="http://schemas.microsoft.com/office/drawing/2016/5/10/chartex" xmlns:cx5="http://schemas.microsoft.com/office/drawing/2016/5/11/chartex" xmlns:cx6="http://schemas.microsoft.com/office/drawing/2016/5/12/chartex" xmlns:cx7="http://schemas.microsoft.com/office/drawing/2016/5/13/chartex" xmlns:cx8="http://schemas.microsoft.com/office/drawing/2016/5/14/chartex" xmlns:mc="http://schemas.openxmlformats.org/markup-compatibility/2006" xmlns:aink="http://schemas.microsoft.com/office/drawing/2016/ink" xmlns:am3d="http://schemas.microsoft.com/office/drawing/2017/model3d" xmlns:o="urn:schemas-microsoft-com:office:office" xmlns:oel="http://schemas.microsoft.com/office/2019/extlst" xmlns:r="http://schemas.openxmlformats.org/officeDocument/2006/relationships" xmlns:m="http://schemas.openxmlformats.org/officeDocument/2006/math" xmlns:v="urn:schemas-microsoft-com:vml" xmlns:wp14="http://schemas.microsoft.com/office/word/2010/wordprocessingDrawing" xmlns:wp="http://schemas.openxmlformats.org/drawingml/2006/wordprocessingDrawing" xmlns:w10="urn:schemas-microsoft-com:office:word" xmlns:w="http://schemas.openxmlformats.org/wordprocessingml/2006/main" xmlns:w14="http://schemas.microsoft.com/office/word/2010/wordml" xmlns:w15="http://schemas.microsoft.com/office/word/2012/wordml" xmlns:w16cex="http://schemas.microsoft.com/office/word/2018/wordml/cex" xmlns:w16cid="http://schemas.microsoft.com/office/word/2016/wordml/cid" xmlns:w16="http://schemas.microsoft.com/office/word/2018/wordml" xmlns:w16du="http://schemas.microsoft.com/office/word/2023/wordml/word16du" xmlns:w16sdtdh="http://schemas.microsoft.com/office/word/2020/wordml/sdtdatahash" xmlns:w16sdtfl="http://schemas.microsoft.com/office/word/2024/wordml/sdtformatlock" xmlns:w16se="http://schemas.microsoft.com/office/word/2015/wordml/symex" xmlns:wpg="http://schemas.microsoft.com/office/word/2010/wordprocessingGroup" xmlns:wpi="http://schemas.microsoft.com/office/word/2010/wordprocessingInk" xmlns:wne="http://schemas.microsoft.com/office/word/2006/wordml" xmlns:wps="http://schemas.microsoft.com/office/word/2010/wordprocessingShape" mc:Ignorable="w14 w15 w16se w16cid w16 w16cex w16sdtdh w16sdtfl w16du wp14">
   <w:abstractNum w:abstractNumId="0" w15:restartNumberingAfterBreak="0">
     <w:nsid w:val="2BF87154"/>
     <w:multiLevelType w:val="multilevel"/>
@@ -2870,7 +2613,7 @@
 </file>
 
 <file path=word/styles.xml><?xml version="1.0" encoding="utf-8"?>
-<w:styles xmlns:mc="http://schemas.openxmlformats.org/markup-compatibility/2006" xmlns:r="http://schemas.openxmlformats.org/officeDocument/2006/relationships" xmlns:w="http://schemas.openxmlformats.org/wordprocessingml/2006/main" xmlns:w14="http://schemas.microsoft.com/office/word/2010/wordml" xmlns:w15="http://schemas.microsoft.com/office/word/2012/wordml" xmlns:w16cex="http://schemas.microsoft.com/office/word/2018/wordml/cex" xmlns:w16cid="http://schemas.microsoft.com/office/word/2016/wordml/cid" xmlns:w16="http://schemas.microsoft.com/office/word/2018/wordml" xmlns:w16sdtdh="http://schemas.microsoft.com/office/word/2020/wordml/sdtdatahash" xmlns:w16se="http://schemas.microsoft.com/office/word/2015/wordml/symex" mc:Ignorable="w14 w15 w16se w16cid w16 w16cex w16sdtdh">
+<w:styles xmlns:mc="http://schemas.openxmlformats.org/markup-compatibility/2006" xmlns:r="http://schemas.openxmlformats.org/officeDocument/2006/relationships" xmlns:w="http://schemas.openxmlformats.org/wordprocessingml/2006/main" xmlns:w14="http://schemas.microsoft.com/office/word/2010/wordml" xmlns:w15="http://schemas.microsoft.com/office/word/2012/wordml" xmlns:w16cex="http://schemas.microsoft.com/office/word/2018/wordml/cex" xmlns:w16cid="http://schemas.microsoft.com/office/word/2016/wordml/cid" xmlns:w16="http://schemas.microsoft.com/office/word/2018/wordml" xmlns:w16du="http://schemas.microsoft.com/office/word/2023/wordml/word16du" xmlns:w16sdtdh="http://schemas.microsoft.com/office/word/2020/wordml/sdtdatahash" xmlns:w16sdtfl="http://schemas.microsoft.com/office/word/2024/wordml/sdtformatlock" xmlns:w16se="http://schemas.microsoft.com/office/word/2015/wordml/symex" mc:Ignorable="w14 w15 w16se w16cid w16 w16cex w16sdtdh w16sdtfl w16du">
   <w:docDefaults>
     <w:rPrDefault>
       <w:rPr>
@@ -3472,6 +3215,7 @@
   <w:style w:type="character" w:default="1" w:styleId="Fuentedeprrafopredeter">
     <w:name w:val="Default Paragraph Font"/>
     <w:uiPriority w:val="1"/>
+    <w:semiHidden/>
     <w:unhideWhenUsed/>
   </w:style>
   <w:style w:type="table" w:default="1" w:styleId="Tablanormal">

</xml_diff>

<commit_message>
creando criterio de linea base
</commit_message>
<xml_diff>
--- a/01_Gestion de configuracion/DOC_Reglas_SCM_v1.docx
+++ b/01_Gestion de configuracion/DOC_Reglas_SCM_v1.docx
@@ -1,6 +1,6 @@
 
 <file path=word/document.xml><?xml version="1.0" encoding="utf-8"?>
-<w:document xmlns:wpc="http://schemas.microsoft.com/office/word/2010/wordprocessingCanvas" xmlns:cx="http://schemas.microsoft.com/office/drawing/2014/chartex" xmlns:cx1="http://schemas.microsoft.com/office/drawing/2015/9/8/chartex" xmlns:cx2="http://schemas.microsoft.com/office/drawing/2015/10/21/chartex" xmlns:cx3="http://schemas.microsoft.com/office/drawing/2016/5/9/chartex" xmlns:cx4="http://schemas.microsoft.com/office/drawing/2016/5/10/chartex" xmlns:cx5="http://schemas.microsoft.com/office/drawing/2016/5/11/chartex" xmlns:cx6="http://schemas.microsoft.com/office/drawing/2016/5/12/chartex" xmlns:cx7="http://schemas.microsoft.com/office/drawing/2016/5/13/chartex" xmlns:cx8="http://schemas.microsoft.com/office/drawing/2016/5/14/chartex" xmlns:mc="http://schemas.openxmlformats.org/markup-compatibility/2006" xmlns:aink="http://schemas.microsoft.com/office/drawing/2016/ink" xmlns:am3d="http://schemas.microsoft.com/office/drawing/2017/model3d" xmlns:o="urn:schemas-microsoft-com:office:office" xmlns:oel="http://schemas.microsoft.com/office/2019/extlst" xmlns:r="http://schemas.openxmlformats.org/officeDocument/2006/relationships" xmlns:m="http://schemas.openxmlformats.org/officeDocument/2006/math" xmlns:v="urn:schemas-microsoft-com:vml" xmlns:wp14="http://schemas.microsoft.com/office/word/2010/wordprocessingDrawing" xmlns:wp="http://schemas.openxmlformats.org/drawingml/2006/wordprocessingDrawing" xmlns:w10="urn:schemas-microsoft-com:office:word" xmlns:w="http://schemas.openxmlformats.org/wordprocessingml/2006/main" xmlns:w14="http://schemas.microsoft.com/office/word/2010/wordml" xmlns:w15="http://schemas.microsoft.com/office/word/2012/wordml" xmlns:w16cex="http://schemas.microsoft.com/office/word/2018/wordml/cex" xmlns:w16cid="http://schemas.microsoft.com/office/word/2016/wordml/cid" xmlns:w16="http://schemas.microsoft.com/office/word/2018/wordml" xmlns:w16du="http://schemas.microsoft.com/office/word/2023/wordml/word16du" xmlns:w16sdtdh="http://schemas.microsoft.com/office/word/2020/wordml/sdtdatahash" xmlns:w16sdtfl="http://schemas.microsoft.com/office/word/2024/wordml/sdtformatlock" xmlns:w16se="http://schemas.microsoft.com/office/word/2015/wordml/symex" xmlns:wpg="http://schemas.microsoft.com/office/word/2010/wordprocessingGroup" xmlns:wpi="http://schemas.microsoft.com/office/word/2010/wordprocessingInk" xmlns:wne="http://schemas.microsoft.com/office/word/2006/wordml" xmlns:wps="http://schemas.microsoft.com/office/word/2010/wordprocessingShape" mc:Ignorable="w14 w15 w16se w16cid w16 w16cex w16sdtdh w16sdtfl w16du wp14">
+<w:document xmlns:wpc="http://schemas.microsoft.com/office/word/2010/wordprocessingCanvas" xmlns:cx="http://schemas.microsoft.com/office/drawing/2014/chartex" xmlns:mc="http://schemas.openxmlformats.org/markup-compatibility/2006" xmlns:o="urn:schemas-microsoft-com:office:office" xmlns:r="http://schemas.openxmlformats.org/officeDocument/2006/relationships" xmlns:m="http://schemas.openxmlformats.org/officeDocument/2006/math" xmlns:v="urn:schemas-microsoft-com:vml" xmlns:wp14="http://schemas.microsoft.com/office/word/2010/wordprocessingDrawing" xmlns:wp="http://schemas.openxmlformats.org/drawingml/2006/wordprocessingDrawing" xmlns:w10="urn:schemas-microsoft-com:office:word" xmlns:w="http://schemas.openxmlformats.org/wordprocessingml/2006/main" xmlns:w14="http://schemas.microsoft.com/office/word/2010/wordml" xmlns:w15="http://schemas.microsoft.com/office/word/2012/wordml" xmlns:w16se="http://schemas.microsoft.com/office/word/2015/wordml/symex" xmlns:wpg="http://schemas.microsoft.com/office/word/2010/wordprocessingGroup" xmlns:wpi="http://schemas.microsoft.com/office/word/2010/wordprocessingInk" xmlns:wne="http://schemas.microsoft.com/office/word/2006/wordml" xmlns:wps="http://schemas.microsoft.com/office/word/2010/wordprocessingShape" mc:Ignorable="w14 w15 w16se wp14">
   <w:body>
     <w:p>
       <w:pPr>
@@ -82,7 +82,7 @@
         <w:rPr>
           <w:b/>
           <w:noProof/>
-          <w:lang w:val="es"/>
+          <w:lang w:val="es-MX" w:eastAsia="es-MX"/>
         </w:rPr>
         <w:drawing>
           <wp:inline distT="0" distB="0" distL="0" distR="0" wp14:anchorId="46EE9918" wp14:editId="5C3E606E">
@@ -325,7 +325,23 @@
       </w:r>
       <w:proofErr w:type="spellEnd"/>
       <w:r>
-        <w:t xml:space="preserve"> Contarino, Nicolas </w:t>
+        <w:t xml:space="preserve"> </w:t>
+      </w:r>
+      <w:proofErr w:type="spellStart"/>
+      <w:r>
+        <w:t>Contarino</w:t>
+      </w:r>
+      <w:proofErr w:type="spellEnd"/>
+      <w:r>
+        <w:t xml:space="preserve">, </w:t>
+      </w:r>
+      <w:proofErr w:type="spellStart"/>
+      <w:r>
+        <w:t>Nicolas</w:t>
+      </w:r>
+      <w:proofErr w:type="spellEnd"/>
+      <w:r>
+        <w:t xml:space="preserve"> </w:t>
       </w:r>
     </w:p>
     <w:p>
@@ -401,7 +417,7 @@
       <w:r>
         <w:rPr>
           <w:noProof/>
-          <w:lang w:val="es-ES"/>
+          <w:lang w:val="es-MX" w:eastAsia="es-MX"/>
         </w:rPr>
         <w:drawing>
           <wp:inline distT="0" distB="0" distL="0" distR="0" wp14:anchorId="21F2B9FB" wp14:editId="1FF55056">
@@ -1920,8 +1936,8 @@
         <w:tblLook w:val="04A0" w:firstRow="1" w:lastRow="0" w:firstColumn="1" w:lastColumn="0" w:noHBand="0" w:noVBand="1"/>
       </w:tblPr>
       <w:tblGrid>
-        <w:gridCol w:w="2055"/>
-        <w:gridCol w:w="6767"/>
+        <w:gridCol w:w="2123"/>
+        <w:gridCol w:w="6699"/>
       </w:tblGrid>
       <w:tr>
         <w:trPr>
@@ -2057,7 +2073,15 @@
             </w:r>
             <w:proofErr w:type="spellEnd"/>
             <w:r>
-              <w:t>, .docx, .</w:t>
+              <w:t>, .</w:t>
+            </w:r>
+            <w:proofErr w:type="spellStart"/>
+            <w:r>
+              <w:t>docx</w:t>
+            </w:r>
+            <w:proofErr w:type="spellEnd"/>
+            <w:r>
+              <w:t>, .</w:t>
             </w:r>
             <w:proofErr w:type="spellStart"/>
             <w:r>
@@ -2216,13 +2240,8 @@
           </w:tcPr>
           <w:p>
             <w:r>
-              <w:t>&lt;</w:t>
-            </w:r>
-            <w:proofErr w:type="spellStart"/>
-            <w:r>
-              <w:t>N°</w:t>
-            </w:r>
-            <w:proofErr w:type="spellEnd"/>
+              <w:t>&lt;N°</w:t>
+            </w:r>
             <w:r>
               <w:t xml:space="preserve"> Tema</w:t>
             </w:r>
@@ -2336,6 +2355,32 @@
       </w:tr>
     </w:tbl>
     <w:p/>
+    <w:p>
+      <w:r>
+        <w:rPr>
+          <w:b/>
+          <w:bCs/>
+        </w:rPr>
+        <w:t>Criterio para la creación de Líneas Base:</w:t>
+      </w:r>
+      <w:r>
+        <w:t xml:space="preserve"> Se establecerá</w:t>
+      </w:r>
+      <w:r>
+        <w:t xml:space="preserve"> la primera Línea Base (v</w:t>
+      </w:r>
+      <w:r>
+        <w:t>1.0) en el repositorio una vez que se haya creado la estructura de carpetas inicial y se haya subido este documento de reglas de configuración. En el futuro, se crearán nuevas líneas base cada vez que se entregue la versión fin</w:t>
+      </w:r>
+      <w:r>
+        <w:t>al de un TP</w:t>
+      </w:r>
+      <w:bookmarkStart w:id="1" w:name="_GoBack"/>
+      <w:bookmarkEnd w:id="1"/>
+      <w:r>
+        <w:t>.</w:t>
+      </w:r>
+    </w:p>
     <w:sectPr>
       <w:pgSz w:w="12240" w:h="15840"/>
       <w:pgMar w:top="1417" w:right="1701" w:bottom="1417" w:left="1701" w:header="720" w:footer="720" w:gutter="0"/>
@@ -2346,7 +2391,7 @@
 </file>
 
 <file path=word/numbering.xml><?xml version="1.0" encoding="utf-8"?>
-<w:numbering xmlns:wpc="http://schemas.microsoft.com/office/word/2010/wordprocessingCanvas" xmlns:cx="http://schemas.microsoft.com/office/drawing/2014/chartex" xmlns:cx1="http://schemas.microsoft.com/office/drawing/2015/9/8/chartex" xmlns:cx2="http://schemas.microsoft.com/office/drawing/2015/10/21/chartex" xmlns:cx3="http://schemas.microsoft.com/office/drawing/2016/5/9/chartex" xmlns:cx4="http://schemas.microsoft.com/office/drawing/2016/5/10/chartex" xmlns:cx5="http://schemas.microsoft.com/office/drawing/2016/5/11/chartex" xmlns:cx6="http://schemas.microsoft.com/office/drawing/2016/5/12/chartex" xmlns:cx7="http://schemas.microsoft.com/office/drawing/2016/5/13/chartex" xmlns:cx8="http://schemas.microsoft.com/office/drawing/2016/5/14/chartex" xmlns:mc="http://schemas.openxmlformats.org/markup-compatibility/2006" xmlns:aink="http://schemas.microsoft.com/office/drawing/2016/ink" xmlns:am3d="http://schemas.microsoft.com/office/drawing/2017/model3d" xmlns:o="urn:schemas-microsoft-com:office:office" xmlns:oel="http://schemas.microsoft.com/office/2019/extlst" xmlns:r="http://schemas.openxmlformats.org/officeDocument/2006/relationships" xmlns:m="http://schemas.openxmlformats.org/officeDocument/2006/math" xmlns:v="urn:schemas-microsoft-com:vml" xmlns:wp14="http://schemas.microsoft.com/office/word/2010/wordprocessingDrawing" xmlns:wp="http://schemas.openxmlformats.org/drawingml/2006/wordprocessingDrawing" xmlns:w10="urn:schemas-microsoft-com:office:word" xmlns:w="http://schemas.openxmlformats.org/wordprocessingml/2006/main" xmlns:w14="http://schemas.microsoft.com/office/word/2010/wordml" xmlns:w15="http://schemas.microsoft.com/office/word/2012/wordml" xmlns:w16cex="http://schemas.microsoft.com/office/word/2018/wordml/cex" xmlns:w16cid="http://schemas.microsoft.com/office/word/2016/wordml/cid" xmlns:w16="http://schemas.microsoft.com/office/word/2018/wordml" xmlns:w16du="http://schemas.microsoft.com/office/word/2023/wordml/word16du" xmlns:w16sdtdh="http://schemas.microsoft.com/office/word/2020/wordml/sdtdatahash" xmlns:w16sdtfl="http://schemas.microsoft.com/office/word/2024/wordml/sdtformatlock" xmlns:w16se="http://schemas.microsoft.com/office/word/2015/wordml/symex" xmlns:wpg="http://schemas.microsoft.com/office/word/2010/wordprocessingGroup" xmlns:wpi="http://schemas.microsoft.com/office/word/2010/wordprocessingInk" xmlns:wne="http://schemas.microsoft.com/office/word/2006/wordml" xmlns:wps="http://schemas.microsoft.com/office/word/2010/wordprocessingShape" mc:Ignorable="w14 w15 w16se w16cid w16 w16cex w16sdtdh w16sdtfl w16du wp14">
+<w:numbering xmlns:wpc="http://schemas.microsoft.com/office/word/2010/wordprocessingCanvas" xmlns:cx="http://schemas.microsoft.com/office/drawing/2014/chartex" xmlns:mc="http://schemas.openxmlformats.org/markup-compatibility/2006" xmlns:o="urn:schemas-microsoft-com:office:office" xmlns:r="http://schemas.openxmlformats.org/officeDocument/2006/relationships" xmlns:m="http://schemas.openxmlformats.org/officeDocument/2006/math" xmlns:v="urn:schemas-microsoft-com:vml" xmlns:wp14="http://schemas.microsoft.com/office/word/2010/wordprocessingDrawing" xmlns:wp="http://schemas.openxmlformats.org/drawingml/2006/wordprocessingDrawing" xmlns:w10="urn:schemas-microsoft-com:office:word" xmlns:w="http://schemas.openxmlformats.org/wordprocessingml/2006/main" xmlns:w14="http://schemas.microsoft.com/office/word/2010/wordml" xmlns:w15="http://schemas.microsoft.com/office/word/2012/wordml" xmlns:w16se="http://schemas.microsoft.com/office/word/2015/wordml/symex" xmlns:wpg="http://schemas.microsoft.com/office/word/2010/wordprocessingGroup" xmlns:wpi="http://schemas.microsoft.com/office/word/2010/wordprocessingInk" xmlns:wne="http://schemas.microsoft.com/office/word/2006/wordml" xmlns:wps="http://schemas.microsoft.com/office/word/2010/wordprocessingShape" mc:Ignorable="w14 w15 w16se wp14">
   <w:abstractNum w:abstractNumId="0" w15:restartNumberingAfterBreak="0">
     <w:nsid w:val="2BF87154"/>
     <w:multiLevelType w:val="multilevel"/>
@@ -2600,20 +2645,20 @@
       </w:rPr>
     </w:lvl>
   </w:abstractNum>
-  <w:num w:numId="1" w16cid:durableId="1485778481">
+  <w:num w:numId="1">
     <w:abstractNumId w:val="0"/>
   </w:num>
-  <w:num w:numId="2" w16cid:durableId="1147939551">
+  <w:num w:numId="2">
     <w:abstractNumId w:val="0"/>
   </w:num>
-  <w:num w:numId="3" w16cid:durableId="2026133926">
+  <w:num w:numId="3">
     <w:abstractNumId w:val="1"/>
   </w:num>
 </w:numbering>
 </file>
 
 <file path=word/styles.xml><?xml version="1.0" encoding="utf-8"?>
-<w:styles xmlns:mc="http://schemas.openxmlformats.org/markup-compatibility/2006" xmlns:r="http://schemas.openxmlformats.org/officeDocument/2006/relationships" xmlns:w="http://schemas.openxmlformats.org/wordprocessingml/2006/main" xmlns:w14="http://schemas.microsoft.com/office/word/2010/wordml" xmlns:w15="http://schemas.microsoft.com/office/word/2012/wordml" xmlns:w16cex="http://schemas.microsoft.com/office/word/2018/wordml/cex" xmlns:w16cid="http://schemas.microsoft.com/office/word/2016/wordml/cid" xmlns:w16="http://schemas.microsoft.com/office/word/2018/wordml" xmlns:w16du="http://schemas.microsoft.com/office/word/2023/wordml/word16du" xmlns:w16sdtdh="http://schemas.microsoft.com/office/word/2020/wordml/sdtdatahash" xmlns:w16sdtfl="http://schemas.microsoft.com/office/word/2024/wordml/sdtformatlock" xmlns:w16se="http://schemas.microsoft.com/office/word/2015/wordml/symex" mc:Ignorable="w14 w15 w16se w16cid w16 w16cex w16sdtdh w16sdtfl w16du">
+<w:styles xmlns:mc="http://schemas.openxmlformats.org/markup-compatibility/2006" xmlns:r="http://schemas.openxmlformats.org/officeDocument/2006/relationships" xmlns:w="http://schemas.openxmlformats.org/wordprocessingml/2006/main" xmlns:w14="http://schemas.microsoft.com/office/word/2010/wordml" xmlns:w15="http://schemas.microsoft.com/office/word/2012/wordml" xmlns:w16se="http://schemas.microsoft.com/office/word/2015/wordml/symex" mc:Ignorable="w14 w15 w16se">
   <w:docDefaults>
     <w:rPrDefault>
       <w:rPr>
@@ -2631,7 +2676,7 @@
       </w:pPr>
     </w:pPrDefault>
   </w:docDefaults>
-  <w:latentStyles w:defLockedState="0" w:defUIPriority="99" w:defSemiHidden="0" w:defUnhideWhenUsed="0" w:defQFormat="0" w:count="376">
+  <w:latentStyles w:defLockedState="0" w:defUIPriority="99" w:defSemiHidden="0" w:defUnhideWhenUsed="0" w:defQFormat="0" w:count="371">
     <w:lsdException w:name="Normal" w:uiPriority="0" w:qFormat="1"/>
     <w:lsdException w:name="heading 1" w:uiPriority="9" w:qFormat="1"/>
     <w:lsdException w:name="heading 2" w:semiHidden="1" w:uiPriority="9" w:unhideWhenUsed="1" w:qFormat="1"/>
@@ -3003,11 +3048,6 @@
     <w:lsdException w:name="List Table 5 Dark Accent 6" w:uiPriority="50"/>
     <w:lsdException w:name="List Table 6 Colorful Accent 6" w:uiPriority="51"/>
     <w:lsdException w:name="List Table 7 Colorful Accent 6" w:uiPriority="52"/>
-    <w:lsdException w:name="Mention" w:semiHidden="1" w:unhideWhenUsed="1"/>
-    <w:lsdException w:name="Smart Hyperlink" w:semiHidden="1" w:unhideWhenUsed="1"/>
-    <w:lsdException w:name="Hashtag" w:semiHidden="1" w:unhideWhenUsed="1"/>
-    <w:lsdException w:name="Unresolved Mention" w:semiHidden="1" w:unhideWhenUsed="1"/>
-    <w:lsdException w:name="Smart Link" w:semiHidden="1" w:unhideWhenUsed="1"/>
   </w:latentStyles>
   <w:style w:type="paragraph" w:default="1" w:styleId="Normal">
     <w:name w:val="Normal"/>

</xml_diff>

<commit_message>
Se actualizo el documento de configuracion
</commit_message>
<xml_diff>
--- a/01_Gestion de configuracion/DOC_Reglas_SCM_v1.docx
+++ b/01_Gestion de configuracion/DOC_Reglas_SCM_v1.docx
@@ -1,6 +1,6 @@
 
 <file path=word/document.xml><?xml version="1.0" encoding="utf-8"?>
-<w:document xmlns:wpc="http://schemas.microsoft.com/office/word/2010/wordprocessingCanvas" xmlns:cx="http://schemas.microsoft.com/office/drawing/2014/chartex" xmlns:mc="http://schemas.openxmlformats.org/markup-compatibility/2006" xmlns:o="urn:schemas-microsoft-com:office:office" xmlns:r="http://schemas.openxmlformats.org/officeDocument/2006/relationships" xmlns:m="http://schemas.openxmlformats.org/officeDocument/2006/math" xmlns:v="urn:schemas-microsoft-com:vml" xmlns:wp14="http://schemas.microsoft.com/office/word/2010/wordprocessingDrawing" xmlns:wp="http://schemas.openxmlformats.org/drawingml/2006/wordprocessingDrawing" xmlns:w10="urn:schemas-microsoft-com:office:word" xmlns:w="http://schemas.openxmlformats.org/wordprocessingml/2006/main" xmlns:w14="http://schemas.microsoft.com/office/word/2010/wordml" xmlns:w15="http://schemas.microsoft.com/office/word/2012/wordml" xmlns:w16se="http://schemas.microsoft.com/office/word/2015/wordml/symex" xmlns:wpg="http://schemas.microsoft.com/office/word/2010/wordprocessingGroup" xmlns:wpi="http://schemas.microsoft.com/office/word/2010/wordprocessingInk" xmlns:wne="http://schemas.microsoft.com/office/word/2006/wordml" xmlns:wps="http://schemas.microsoft.com/office/word/2010/wordprocessingShape" mc:Ignorable="w14 w15 w16se wp14">
+<w:document xmlns:wpc="http://schemas.microsoft.com/office/word/2010/wordprocessingCanvas" xmlns:cx="http://schemas.microsoft.com/office/drawing/2014/chartex" xmlns:cx1="http://schemas.microsoft.com/office/drawing/2015/9/8/chartex" xmlns:cx2="http://schemas.microsoft.com/office/drawing/2015/10/21/chartex" xmlns:cx3="http://schemas.microsoft.com/office/drawing/2016/5/9/chartex" xmlns:cx4="http://schemas.microsoft.com/office/drawing/2016/5/10/chartex" xmlns:cx5="http://schemas.microsoft.com/office/drawing/2016/5/11/chartex" xmlns:cx6="http://schemas.microsoft.com/office/drawing/2016/5/12/chartex" xmlns:cx7="http://schemas.microsoft.com/office/drawing/2016/5/13/chartex" xmlns:cx8="http://schemas.microsoft.com/office/drawing/2016/5/14/chartex" xmlns:mc="http://schemas.openxmlformats.org/markup-compatibility/2006" xmlns:aink="http://schemas.microsoft.com/office/drawing/2016/ink" xmlns:am3d="http://schemas.microsoft.com/office/drawing/2017/model3d" xmlns:o="urn:schemas-microsoft-com:office:office" xmlns:oel="http://schemas.microsoft.com/office/2019/extlst" xmlns:r="http://schemas.openxmlformats.org/officeDocument/2006/relationships" xmlns:m="http://schemas.openxmlformats.org/officeDocument/2006/math" xmlns:v="urn:schemas-microsoft-com:vml" xmlns:wp14="http://schemas.microsoft.com/office/word/2010/wordprocessingDrawing" xmlns:wp="http://schemas.openxmlformats.org/drawingml/2006/wordprocessingDrawing" xmlns:w10="urn:schemas-microsoft-com:office:word" xmlns:w="http://schemas.openxmlformats.org/wordprocessingml/2006/main" xmlns:w14="http://schemas.microsoft.com/office/word/2010/wordml" xmlns:w15="http://schemas.microsoft.com/office/word/2012/wordml" xmlns:w16cex="http://schemas.microsoft.com/office/word/2018/wordml/cex" xmlns:w16cid="http://schemas.microsoft.com/office/word/2016/wordml/cid" xmlns:w16="http://schemas.microsoft.com/office/word/2018/wordml" xmlns:w16sdtdh="http://schemas.microsoft.com/office/word/2020/wordml/sdtdatahash" xmlns:w16se="http://schemas.microsoft.com/office/word/2015/wordml/symex" xmlns:wpg="http://schemas.microsoft.com/office/word/2010/wordprocessingGroup" xmlns:wpi="http://schemas.microsoft.com/office/word/2010/wordprocessingInk" xmlns:wne="http://schemas.microsoft.com/office/word/2006/wordml" xmlns:wps="http://schemas.microsoft.com/office/word/2010/wordprocessingShape" mc:Ignorable="w14 w15 w16se w16cid w16 w16cex w16sdtdh wp14">
   <w:body>
     <w:p>
       <w:pPr>
@@ -333,15 +333,7 @@
       </w:r>
       <w:proofErr w:type="spellEnd"/>
       <w:r>
-        <w:t xml:space="preserve">, </w:t>
-      </w:r>
-      <w:proofErr w:type="spellStart"/>
-      <w:r>
-        <w:t>Nicolas</w:t>
-      </w:r>
-      <w:proofErr w:type="spellEnd"/>
-      <w:r>
-        <w:t xml:space="preserve"> </w:t>
+        <w:t xml:space="preserve">, Nicolas </w:t>
       </w:r>
     </w:p>
     <w:p>
@@ -1914,7 +1906,136 @@
               <w:rPr>
                 <w:lang w:val="es-ES"/>
               </w:rPr>
-              <w:t>Documentación</w:t>
+              <w:t>Material adicional</w:t>
+            </w:r>
+          </w:p>
+        </w:tc>
+      </w:tr>
+      <w:tr>
+        <w:tc>
+          <w:tcPr>
+            <w:tcW w:w="2235" w:type="dxa"/>
+            <w:tcBorders>
+              <w:top w:val="single" w:sz="8" w:space="0" w:color="000000"/>
+              <w:left w:val="single" w:sz="8" w:space="0" w:color="000000"/>
+              <w:bottom w:val="single" w:sz="8" w:space="0" w:color="000000"/>
+              <w:right w:val="single" w:sz="8" w:space="0" w:color="000000"/>
+            </w:tcBorders>
+            <w:tcMar>
+              <w:top w:w="100" w:type="dxa"/>
+              <w:left w:w="100" w:type="dxa"/>
+              <w:bottom w:w="100" w:type="dxa"/>
+              <w:right w:w="100" w:type="dxa"/>
+            </w:tcMar>
+          </w:tcPr>
+          <w:p>
+            <w:pPr>
+              <w:rPr>
+                <w:lang w:val="es-ES"/>
+              </w:rPr>
+            </w:pPr>
+            <w:r>
+              <w:rPr>
+                <w:lang w:val="es-ES"/>
+              </w:rPr>
+              <w:lastRenderedPageBreak/>
+              <w:t>Resumen Asignatura</w:t>
+            </w:r>
+          </w:p>
+        </w:tc>
+        <w:tc>
+          <w:tcPr>
+            <w:tcW w:w="2433" w:type="dxa"/>
+            <w:tcBorders>
+              <w:top w:val="single" w:sz="8" w:space="0" w:color="000000"/>
+              <w:left w:val="single" w:sz="8" w:space="0" w:color="000000"/>
+              <w:bottom w:val="single" w:sz="8" w:space="0" w:color="000000"/>
+              <w:right w:val="single" w:sz="8" w:space="0" w:color="000000"/>
+            </w:tcBorders>
+            <w:tcMar>
+              <w:top w:w="100" w:type="dxa"/>
+              <w:left w:w="100" w:type="dxa"/>
+              <w:bottom w:w="100" w:type="dxa"/>
+              <w:right w:w="100" w:type="dxa"/>
+            </w:tcMar>
+          </w:tcPr>
+          <w:p>
+            <w:pPr>
+              <w:rPr>
+                <w:lang w:val="es-ES"/>
+              </w:rPr>
+            </w:pPr>
+            <w:r>
+              <w:rPr>
+                <w:lang w:val="es-ES"/>
+              </w:rPr>
+              <w:t>RESUMEN_Completo_2023ISW_240229_174453</w:t>
+            </w:r>
+          </w:p>
+        </w:tc>
+        <w:tc>
+          <w:tcPr>
+            <w:tcW w:w="2082" w:type="dxa"/>
+            <w:tcBorders>
+              <w:top w:val="single" w:sz="8" w:space="0" w:color="000000"/>
+              <w:left w:val="single" w:sz="8" w:space="0" w:color="000000"/>
+              <w:bottom w:val="single" w:sz="8" w:space="0" w:color="000000"/>
+              <w:right w:val="single" w:sz="8" w:space="0" w:color="000000"/>
+            </w:tcBorders>
+            <w:tcMar>
+              <w:top w:w="100" w:type="dxa"/>
+              <w:left w:w="100" w:type="dxa"/>
+              <w:bottom w:w="100" w:type="dxa"/>
+              <w:right w:w="100" w:type="dxa"/>
+            </w:tcMar>
+          </w:tcPr>
+          <w:p>
+            <w:pPr>
+              <w:rPr>
+                <w:lang w:val="es-ES"/>
+              </w:rPr>
+            </w:pPr>
+            <w:r>
+              <w:rPr>
+                <w:lang w:val="es-ES"/>
+              </w:rPr>
+              <w:t>/04_Materiales Adicionales/</w:t>
+            </w:r>
+            <w:r>
+              <w:rPr>
+                <w:lang w:val="es-ES"/>
+              </w:rPr>
+              <w:t>Material de apoyo</w:t>
+            </w:r>
+          </w:p>
+        </w:tc>
+        <w:tc>
+          <w:tcPr>
+            <w:tcW w:w="2190" w:type="dxa"/>
+            <w:tcBorders>
+              <w:top w:val="single" w:sz="8" w:space="0" w:color="000000"/>
+              <w:left w:val="single" w:sz="8" w:space="0" w:color="000000"/>
+              <w:bottom w:val="single" w:sz="8" w:space="0" w:color="000000"/>
+              <w:right w:val="single" w:sz="8" w:space="0" w:color="000000"/>
+            </w:tcBorders>
+            <w:tcMar>
+              <w:top w:w="100" w:type="dxa"/>
+              <w:left w:w="100" w:type="dxa"/>
+              <w:bottom w:w="100" w:type="dxa"/>
+              <w:right w:w="100" w:type="dxa"/>
+            </w:tcMar>
+          </w:tcPr>
+          <w:p>
+            <w:pPr>
+              <w:rPr>
+                <w:lang w:val="es-ES"/>
+              </w:rPr>
+            </w:pPr>
+            <w:r>
+              <w:rPr>
+                <w:lang w:val="es-ES"/>
+              </w:rPr>
+              <w:t>Material adicional</w:t>
             </w:r>
           </w:p>
         </w:tc>
@@ -1936,8 +2057,8 @@
         <w:tblLook w:val="04A0" w:firstRow="1" w:lastRow="0" w:firstColumn="1" w:lastColumn="0" w:noHBand="0" w:noVBand="1"/>
       </w:tblPr>
       <w:tblGrid>
-        <w:gridCol w:w="2123"/>
-        <w:gridCol w:w="6699"/>
+        <w:gridCol w:w="2055"/>
+        <w:gridCol w:w="6767"/>
       </w:tblGrid>
       <w:tr>
         <w:trPr>
@@ -2073,15 +2194,7 @@
             </w:r>
             <w:proofErr w:type="spellEnd"/>
             <w:r>
-              <w:t>, .</w:t>
-            </w:r>
-            <w:proofErr w:type="spellStart"/>
-            <w:r>
-              <w:t>docx</w:t>
-            </w:r>
-            <w:proofErr w:type="spellEnd"/>
-            <w:r>
-              <w:t>, .</w:t>
+              <w:t>, .docx, .</w:t>
             </w:r>
             <w:proofErr w:type="spellStart"/>
             <w:r>
@@ -2364,21 +2477,7 @@
         <w:t>Criterio para la creación de Líneas Base:</w:t>
       </w:r>
       <w:r>
-        <w:t xml:space="preserve"> Se establecerá</w:t>
-      </w:r>
-      <w:r>
-        <w:t xml:space="preserve"> la primera Línea Base (v</w:t>
-      </w:r>
-      <w:r>
-        <w:t>1.0) en el repositorio una vez que se haya creado la estructura de carpetas inicial y se haya subido este documento de reglas de configuración. En el futuro, se crearán nuevas líneas base cada vez que se entregue la versión fin</w:t>
-      </w:r>
-      <w:r>
-        <w:t>al de un TP</w:t>
-      </w:r>
-      <w:bookmarkStart w:id="1" w:name="_GoBack"/>
-      <w:bookmarkEnd w:id="1"/>
-      <w:r>
-        <w:t>.</w:t>
+        <w:t xml:space="preserve"> Se establecerá la primera Línea Base (v1.0) en el repositorio una vez que se haya creado la estructura de carpetas inicial y se haya subido este documento de reglas de configuración. En el futuro, se crearán nuevas líneas base cada vez que se entregue la versión final de un TP.</w:t>
       </w:r>
     </w:p>
     <w:sectPr>
@@ -2391,7 +2490,7 @@
 </file>
 
 <file path=word/numbering.xml><?xml version="1.0" encoding="utf-8"?>
-<w:numbering xmlns:wpc="http://schemas.microsoft.com/office/word/2010/wordprocessingCanvas" xmlns:cx="http://schemas.microsoft.com/office/drawing/2014/chartex" xmlns:mc="http://schemas.openxmlformats.org/markup-compatibility/2006" xmlns:o="urn:schemas-microsoft-com:office:office" xmlns:r="http://schemas.openxmlformats.org/officeDocument/2006/relationships" xmlns:m="http://schemas.openxmlformats.org/officeDocument/2006/math" xmlns:v="urn:schemas-microsoft-com:vml" xmlns:wp14="http://schemas.microsoft.com/office/word/2010/wordprocessingDrawing" xmlns:wp="http://schemas.openxmlformats.org/drawingml/2006/wordprocessingDrawing" xmlns:w10="urn:schemas-microsoft-com:office:word" xmlns:w="http://schemas.openxmlformats.org/wordprocessingml/2006/main" xmlns:w14="http://schemas.microsoft.com/office/word/2010/wordml" xmlns:w15="http://schemas.microsoft.com/office/word/2012/wordml" xmlns:w16se="http://schemas.microsoft.com/office/word/2015/wordml/symex" xmlns:wpg="http://schemas.microsoft.com/office/word/2010/wordprocessingGroup" xmlns:wpi="http://schemas.microsoft.com/office/word/2010/wordprocessingInk" xmlns:wne="http://schemas.microsoft.com/office/word/2006/wordml" xmlns:wps="http://schemas.microsoft.com/office/word/2010/wordprocessingShape" mc:Ignorable="w14 w15 w16se wp14">
+<w:numbering xmlns:wpc="http://schemas.microsoft.com/office/word/2010/wordprocessingCanvas" xmlns:cx="http://schemas.microsoft.com/office/drawing/2014/chartex" xmlns:cx1="http://schemas.microsoft.com/office/drawing/2015/9/8/chartex" xmlns:cx2="http://schemas.microsoft.com/office/drawing/2015/10/21/chartex" xmlns:cx3="http://schemas.microsoft.com/office/drawing/2016/5/9/chartex" xmlns:cx4="http://schemas.microsoft.com/office/drawing/2016/5/10/chartex" xmlns:cx5="http://schemas.microsoft.com/office/drawing/2016/5/11/chartex" xmlns:cx6="http://schemas.microsoft.com/office/drawing/2016/5/12/chartex" xmlns:cx7="http://schemas.microsoft.com/office/drawing/2016/5/13/chartex" xmlns:cx8="http://schemas.microsoft.com/office/drawing/2016/5/14/chartex" xmlns:mc="http://schemas.openxmlformats.org/markup-compatibility/2006" xmlns:aink="http://schemas.microsoft.com/office/drawing/2016/ink" xmlns:am3d="http://schemas.microsoft.com/office/drawing/2017/model3d" xmlns:o="urn:schemas-microsoft-com:office:office" xmlns:oel="http://schemas.microsoft.com/office/2019/extlst" xmlns:r="http://schemas.openxmlformats.org/officeDocument/2006/relationships" xmlns:m="http://schemas.openxmlformats.org/officeDocument/2006/math" xmlns:v="urn:schemas-microsoft-com:vml" xmlns:wp14="http://schemas.microsoft.com/office/word/2010/wordprocessingDrawing" xmlns:wp="http://schemas.openxmlformats.org/drawingml/2006/wordprocessingDrawing" xmlns:w10="urn:schemas-microsoft-com:office:word" xmlns:w="http://schemas.openxmlformats.org/wordprocessingml/2006/main" xmlns:w14="http://schemas.microsoft.com/office/word/2010/wordml" xmlns:w15="http://schemas.microsoft.com/office/word/2012/wordml" xmlns:w16cex="http://schemas.microsoft.com/office/word/2018/wordml/cex" xmlns:w16cid="http://schemas.microsoft.com/office/word/2016/wordml/cid" xmlns:w16="http://schemas.microsoft.com/office/word/2018/wordml" xmlns:w16sdtdh="http://schemas.microsoft.com/office/word/2020/wordml/sdtdatahash" xmlns:w16se="http://schemas.microsoft.com/office/word/2015/wordml/symex" xmlns:wpg="http://schemas.microsoft.com/office/word/2010/wordprocessingGroup" xmlns:wpi="http://schemas.microsoft.com/office/word/2010/wordprocessingInk" xmlns:wne="http://schemas.microsoft.com/office/word/2006/wordml" xmlns:wps="http://schemas.microsoft.com/office/word/2010/wordprocessingShape" mc:Ignorable="w14 w15 w16se w16cid w16 w16cex w16sdtdh wp14">
   <w:abstractNum w:abstractNumId="0" w15:restartNumberingAfterBreak="0">
     <w:nsid w:val="2BF87154"/>
     <w:multiLevelType w:val="multilevel"/>
@@ -2645,20 +2744,20 @@
       </w:rPr>
     </w:lvl>
   </w:abstractNum>
-  <w:num w:numId="1">
+  <w:num w:numId="1" w16cid:durableId="1655986856">
     <w:abstractNumId w:val="0"/>
   </w:num>
-  <w:num w:numId="2">
+  <w:num w:numId="2" w16cid:durableId="1355301372">
     <w:abstractNumId w:val="0"/>
   </w:num>
-  <w:num w:numId="3">
+  <w:num w:numId="3" w16cid:durableId="378747725">
     <w:abstractNumId w:val="1"/>
   </w:num>
 </w:numbering>
 </file>
 
 <file path=word/styles.xml><?xml version="1.0" encoding="utf-8"?>
-<w:styles xmlns:mc="http://schemas.openxmlformats.org/markup-compatibility/2006" xmlns:r="http://schemas.openxmlformats.org/officeDocument/2006/relationships" xmlns:w="http://schemas.openxmlformats.org/wordprocessingml/2006/main" xmlns:w14="http://schemas.microsoft.com/office/word/2010/wordml" xmlns:w15="http://schemas.microsoft.com/office/word/2012/wordml" xmlns:w16se="http://schemas.microsoft.com/office/word/2015/wordml/symex" mc:Ignorable="w14 w15 w16se">
+<w:styles xmlns:mc="http://schemas.openxmlformats.org/markup-compatibility/2006" xmlns:r="http://schemas.openxmlformats.org/officeDocument/2006/relationships" xmlns:w="http://schemas.openxmlformats.org/wordprocessingml/2006/main" xmlns:w14="http://schemas.microsoft.com/office/word/2010/wordml" xmlns:w15="http://schemas.microsoft.com/office/word/2012/wordml" xmlns:w16cex="http://schemas.microsoft.com/office/word/2018/wordml/cex" xmlns:w16cid="http://schemas.microsoft.com/office/word/2016/wordml/cid" xmlns:w16="http://schemas.microsoft.com/office/word/2018/wordml" xmlns:w16sdtdh="http://schemas.microsoft.com/office/word/2020/wordml/sdtdatahash" xmlns:w16se="http://schemas.microsoft.com/office/word/2015/wordml/symex" mc:Ignorable="w14 w15 w16se w16cid w16 w16cex w16sdtdh">
   <w:docDefaults>
     <w:rPrDefault>
       <w:rPr>
@@ -2676,7 +2775,7 @@
       </w:pPr>
     </w:pPrDefault>
   </w:docDefaults>
-  <w:latentStyles w:defLockedState="0" w:defUIPriority="99" w:defSemiHidden="0" w:defUnhideWhenUsed="0" w:defQFormat="0" w:count="371">
+  <w:latentStyles w:defLockedState="0" w:defUIPriority="99" w:defSemiHidden="0" w:defUnhideWhenUsed="0" w:defQFormat="0" w:count="376">
     <w:lsdException w:name="Normal" w:uiPriority="0" w:qFormat="1"/>
     <w:lsdException w:name="heading 1" w:uiPriority="9" w:qFormat="1"/>
     <w:lsdException w:name="heading 2" w:semiHidden="1" w:uiPriority="9" w:unhideWhenUsed="1" w:qFormat="1"/>
@@ -3048,6 +3147,11 @@
     <w:lsdException w:name="List Table 5 Dark Accent 6" w:uiPriority="50"/>
     <w:lsdException w:name="List Table 6 Colorful Accent 6" w:uiPriority="51"/>
     <w:lsdException w:name="List Table 7 Colorful Accent 6" w:uiPriority="52"/>
+    <w:lsdException w:name="Mention" w:semiHidden="1" w:unhideWhenUsed="1"/>
+    <w:lsdException w:name="Smart Hyperlink" w:semiHidden="1" w:unhideWhenUsed="1"/>
+    <w:lsdException w:name="Hashtag" w:semiHidden="1" w:unhideWhenUsed="1"/>
+    <w:lsdException w:name="Unresolved Mention" w:semiHidden="1" w:unhideWhenUsed="1"/>
+    <w:lsdException w:name="Smart Link" w:semiHidden="1" w:unhideWhenUsed="1"/>
   </w:latentStyles>
   <w:style w:type="paragraph" w:default="1" w:styleId="Normal">
     <w:name w:val="Normal"/>

</xml_diff>